<commit_message>
Mehrere Dome: Kammerwahl per DomeNo (Schnittstelle Version 3)
Tankwagen mit mehreren offenen Domen fuehren nicht mehr zu Fehler 21.
- Erkennung liefert alle offenen Dome, sortiert von vorn (vehicle.front)
- DomeNo 0 = automatisch der naechste erreichbare (Kammern verbunden),
  n = n-ter offener Dom von vorn (Mehrkammer), Fehler 22 wenn nicht vorhanden
- DomeCount/DomeSelected zurueck an die SPS; DB_Vision und Doku angepasst
- Job 1 vom vorigen Dom aus: erst senkrecht hoch, Aufbauten der anderen Dome
  als Hindernisse, eigener Arm verdeckt die Oeffnung nicht mehr
- Simulation: 1-3 offene Dome je Fahrzeug, SPS-Simulator mit Fuellschritten
  (Befehl k), Dauertest wechselt verbunden/Mehrkammer
- min_surface_fraction 0.3 -> 0.2 (viele Aufbauten auf dem Dach)

Co-Authored-By: Claude Opus 5.5 <noreply@anthropic.com>
Claude-Session: https://claude.ai/code/session_011gVh9Tuq2M9eoPkrYc3XcP
</commit_message>
<xml_diff>
--- a/docs/extern/SWD-4793_Softwaredokumentation_Entwurf.docx
+++ b/docs/extern/SWD-4793_Softwaredokumentation_Entwurf.docx
@@ -967,7 +967,7 @@
                 <w:sz w:val="20"/>
                 <w:szCs w:val="20"/>
               </w:rPr>
-              <w:t xml:space="preserve">InterfaceVersion 2 (Version 3 mit Nachziehen in Vorbereitung)</w:t>
+              <w:t xml:space="preserve">InterfaceVersion 3 (mehrere Dome)</w:t>
             </w:r>
           </w:p>
         </w:tc>
@@ -1994,7 +1994,7 @@
           <w:sz w:val="20"/>
           <w:szCs w:val="20"/>
         </w:rPr>
-        <w:t xml:space="preserve">InterfaceVersion = 2</w:t>
+        <w:t xml:space="preserve">InterfaceVersion = 3</w:t>
       </w:r>
       <w:r>
         <w:rPr>
@@ -2511,6 +2511,93 @@
                 <w:sz w:val="20"/>
                 <w:szCs w:val="20"/>
               </w:rPr>
+              <w:t xml:space="preserve">DomeNo</w:t>
+            </w:r>
+          </w:p>
+        </w:tc>
+        <w:tc>
+          <w:tcPr>
+            <w:tcW w:type="dxa" w:w="1300"/>
+            <w:tcBorders>
+              <w:top w:val="single" w:color="808080" w:sz="4"/>
+              <w:left w:val="single" w:color="808080" w:sz="4"/>
+              <w:bottom w:val="single" w:color="808080" w:sz="4"/>
+              <w:right w:val="single" w:color="808080" w:sz="4"/>
+            </w:tcBorders>
+            <w:tcMar>
+              <w:top w:type="dxa" w:w="60"/>
+              <w:left w:type="dxa" w:w="100"/>
+              <w:bottom w:type="dxa" w:w="60"/>
+              <w:right w:type="dxa" w:w="100"/>
+            </w:tcMar>
+          </w:tcPr>
+          <w:p>
+            <w:r>
+              <w:rPr>
+                <w:rFonts w:ascii="Arial" w:cs="Arial" w:eastAsia="Arial" w:hAnsi="Arial"/>
+                <w:sz w:val="20"/>
+                <w:szCs w:val="20"/>
+              </w:rPr>
+              <w:t xml:space="preserve">Int</w:t>
+            </w:r>
+          </w:p>
+        </w:tc>
+        <w:tc>
+          <w:tcPr>
+            <w:tcW w:type="dxa" w:w="5738"/>
+            <w:tcBorders>
+              <w:top w:val="single" w:color="808080" w:sz="4"/>
+              <w:left w:val="single" w:color="808080" w:sz="4"/>
+              <w:bottom w:val="single" w:color="808080" w:sz="4"/>
+              <w:right w:val="single" w:color="808080" w:sz="4"/>
+            </w:tcBorders>
+            <w:tcMar>
+              <w:top w:type="dxa" w:w="60"/>
+              <w:left w:type="dxa" w:w="100"/>
+              <w:bottom w:type="dxa" w:w="60"/>
+              <w:right w:type="dxa" w:w="100"/>
+            </w:tcMar>
+          </w:tcPr>
+          <w:p>
+            <w:r>
+              <w:rPr>
+                <w:rFonts w:ascii="Arial" w:cs="Arial" w:eastAsia="Arial" w:hAnsi="Arial"/>
+                <w:sz w:val="20"/>
+                <w:szCs w:val="20"/>
+              </w:rPr>
+              <w:t xml:space="preserve">Welcher Dom: 0 = automatisch (Kammern verbunden), n = n-ter offener Dom von vorn (Mehrkammer)</w:t>
+            </w:r>
+          </w:p>
+        </w:tc>
+      </w:tr>
+      <w:tr>
+        <w:trPr>
+          <w:cantSplit/>
+          <w:tblHeader w:val="off"/>
+        </w:trPr>
+        <w:tc>
+          <w:tcPr>
+            <w:tcW w:type="dxa" w:w="2600"/>
+            <w:tcBorders>
+              <w:top w:val="single" w:color="808080" w:sz="4"/>
+              <w:left w:val="single" w:color="808080" w:sz="4"/>
+              <w:bottom w:val="single" w:color="808080" w:sz="4"/>
+              <w:right w:val="single" w:color="808080" w:sz="4"/>
+            </w:tcBorders>
+            <w:tcMar>
+              <w:top w:type="dxa" w:w="60"/>
+              <w:left w:type="dxa" w:w="100"/>
+              <w:bottom w:type="dxa" w:w="60"/>
+              <w:right w:type="dxa" w:w="100"/>
+            </w:tcMar>
+          </w:tcPr>
+          <w:p>
+            <w:r>
+              <w:rPr>
+                <w:rFonts w:ascii="Arial" w:cs="Arial" w:eastAsia="Arial" w:hAnsi="Arial"/>
+                <w:sz w:val="20"/>
+                <w:szCs w:val="20"/>
+              </w:rPr>
               <w:t xml:space="preserve">Reset</w:t>
             </w:r>
           </w:p>
@@ -3892,6 +3979,93 @@
                 <w:sz w:val="20"/>
                 <w:szCs w:val="20"/>
               </w:rPr>
+              <w:t xml:space="preserve">DomeCount / DomeSelected</w:t>
+            </w:r>
+          </w:p>
+        </w:tc>
+        <w:tc>
+          <w:tcPr>
+            <w:tcW w:type="dxa" w:w="1300"/>
+            <w:tcBorders>
+              <w:top w:val="single" w:color="808080" w:sz="4"/>
+              <w:left w:val="single" w:color="808080" w:sz="4"/>
+              <w:bottom w:val="single" w:color="808080" w:sz="4"/>
+              <w:right w:val="single" w:color="808080" w:sz="4"/>
+            </w:tcBorders>
+            <w:tcMar>
+              <w:top w:type="dxa" w:w="60"/>
+              <w:left w:type="dxa" w:w="100"/>
+              <w:bottom w:type="dxa" w:w="60"/>
+              <w:right w:type="dxa" w:w="100"/>
+            </w:tcMar>
+          </w:tcPr>
+          <w:p>
+            <w:r>
+              <w:rPr>
+                <w:rFonts w:ascii="Arial" w:cs="Arial" w:eastAsia="Arial" w:hAnsi="Arial"/>
+                <w:sz w:val="20"/>
+                <w:szCs w:val="20"/>
+              </w:rPr>
+              <w:t xml:space="preserve">Int</w:t>
+            </w:r>
+          </w:p>
+        </w:tc>
+        <w:tc>
+          <w:tcPr>
+            <w:tcW w:type="dxa" w:w="5738"/>
+            <w:tcBorders>
+              <w:top w:val="single" w:color="808080" w:sz="4"/>
+              <w:left w:val="single" w:color="808080" w:sz="4"/>
+              <w:bottom w:val="single" w:color="808080" w:sz="4"/>
+              <w:right w:val="single" w:color="808080" w:sz="4"/>
+            </w:tcBorders>
+            <w:tcMar>
+              <w:top w:type="dxa" w:w="60"/>
+              <w:left w:type="dxa" w:w="100"/>
+              <w:bottom w:type="dxa" w:w="60"/>
+              <w:right w:type="dxa" w:w="100"/>
+            </w:tcMar>
+          </w:tcPr>
+          <w:p>
+            <w:r>
+              <w:rPr>
+                <w:rFonts w:ascii="Arial" w:cs="Arial" w:eastAsia="Arial" w:hAnsi="Arial"/>
+                <w:sz w:val="20"/>
+                <w:szCs w:val="20"/>
+              </w:rPr>
+              <w:t xml:space="preserve">Erkannte offene Dome / angefahrener Dom von vorn</w:t>
+            </w:r>
+          </w:p>
+        </w:tc>
+      </w:tr>
+      <w:tr>
+        <w:trPr>
+          <w:cantSplit/>
+          <w:tblHeader w:val="off"/>
+        </w:trPr>
+        <w:tc>
+          <w:tcPr>
+            <w:tcW w:type="dxa" w:w="2600"/>
+            <w:tcBorders>
+              <w:top w:val="single" w:color="808080" w:sz="4"/>
+              <w:left w:val="single" w:color="808080" w:sz="4"/>
+              <w:bottom w:val="single" w:color="808080" w:sz="4"/>
+              <w:right w:val="single" w:color="808080" w:sz="4"/>
+            </w:tcBorders>
+            <w:tcMar>
+              <w:top w:type="dxa" w:w="60"/>
+              <w:left w:type="dxa" w:w="100"/>
+              <w:bottom w:type="dxa" w:w="60"/>
+              <w:right w:type="dxa" w:w="100"/>
+            </w:tcMar>
+          </w:tcPr>
+          <w:p>
+            <w:r>
+              <w:rPr>
+                <w:rFonts w:ascii="Arial" w:cs="Arial" w:eastAsia="Arial" w:hAnsi="Arial"/>
+                <w:sz w:val="20"/>
+                <w:szCs w:val="20"/>
+              </w:rPr>
               <w:t xml:space="preserve">WaypointCount</w:t>
             </w:r>
           </w:p>
@@ -4525,7 +4699,7 @@
                 <w:sz w:val="20"/>
                 <w:szCs w:val="20"/>
               </w:rPr>
-              <w:t xml:space="preserve">Dom und Deckel messen, Bahn ab Istlage planen</w:t>
+              <w:t xml:space="preserve">Dom (DomeNo) und Deckel messen, Bahn ab Istlage planen</w:t>
             </w:r>
           </w:p>
         </w:tc>
@@ -4552,7 +4726,7 @@
                 <w:sz w:val="20"/>
                 <w:szCs w:val="20"/>
               </w:rPr>
-              <w:t xml:space="preserve">Anfahrt (ggf. mit Umweg), senkrechtes Absenken, Eintauchen; ApproachIndex = Anfahrpunkt über dem Dom</w:t>
+              <w:t xml:space="preserve">vom vorigen Dom aus erst senkrecht hoch; Anfahrt (ggf. mit Umweg), senkrechtes Absenken, Eintauchen; ApproachIndex = Anfahrpunkt über dem Dom</w:t>
             </w:r>
           </w:p>
         </w:tc>
@@ -4839,6 +5013,29 @@
     </w:p>
     <w:p>
       <w:pPr>
+        <w:spacing w:after="120"/>
+      </w:pPr>
+      <w:r>
+        <w:rPr>
+          <w:rFonts w:ascii="Arial" w:cs="Arial" w:eastAsia="Arial" w:hAnsi="Arial"/>
+          <w:b/>
+          <w:bCs/>
+          <w:sz w:val="20"/>
+          <w:szCs w:val="20"/>
+        </w:rPr>
+        <w:t xml:space="preserve">Tankwagen mit mehreren Domen:</w:t>
+      </w:r>
+      <w:r>
+        <w:rPr>
+          <w:rFonts w:ascii="Arial" w:cs="Arial" w:eastAsia="Arial" w:hAnsi="Arial"/>
+          <w:sz w:val="20"/>
+          <w:szCs w:val="20"/>
+        </w:rPr>
+        <w:t xml:space="preserve"> Ob die Kammern verbunden (Schwallwände) oder getrennt (Mehrkammer) sind, weiß nur der Auftrag. Verbunden: ein Füllschritt mit DomeNo = 0, der Vision-PC wählt den nächsten erreichbaren Dom. Mehrkammer: ein Füllschritt je Kammer (DomeNo 1, 2, … von vorn, eigene Menge); dazwischen fährt die SPS senkrecht heraus bis über den Dom und startet Job 1 aus der Istlage, ohne Umweg über die Parkstellung. Die Kamera muss alle Dome sehen.</w:t>
+      </w:r>
+    </w:p>
+    <w:p>
+      <w:pPr>
         <w:pStyle w:val="Heading2"/>
         <w:keepNext/>
         <w:spacing w:after="100" w:before="200"/>
@@ -4869,7 +5066,7 @@
           <w:sz w:val="20"/>
           <w:szCs w:val="20"/>
         </w:rPr>
-        <w:t xml:space="preserve">SPS setzt Job, ProductId und Istwerte, danach Trigger (nur wenn Ready = TRUE).</w:t>
+        <w:t xml:space="preserve">SPS setzt Job, ProductId, DomeNo und Istwerte, danach Trigger (nur wenn Ready = TRUE).</w:t>
       </w:r>
     </w:p>
     <w:p>
@@ -5167,7 +5364,7 @@
           <w:szCs w:val="20"/>
           <w:highlight w:val="yellow"/>
         </w:rPr>
-        <w:t xml:space="preserve">[Höhe je Stützpunkt mit InterfaceVersion 3 vom Vision-PC]</w:t>
+        <w:t xml:space="preserve">[Höhe je Stützpunkt mit InterfaceVersion 4 vom Vision-PC]</w:t>
       </w:r>
       <w:r>
         <w:rPr>
@@ -5572,7 +5769,67 @@
                 <w:sz w:val="20"/>
                 <w:szCs w:val="20"/>
               </w:rPr>
-              <w:t xml:space="preserve">Mehrere Domöffnungen gefunden</w:t>
+              <w:t xml:space="preserve">Mehrere Domöffnungen gefunden (nur bis Version 2)</w:t>
+            </w:r>
+          </w:p>
+        </w:tc>
+      </w:tr>
+      <w:tr>
+        <w:trPr>
+          <w:cantSplit/>
+          <w:tblHeader w:val="off"/>
+        </w:trPr>
+        <w:tc>
+          <w:tcPr>
+            <w:tcW w:type="dxa" w:w="1000"/>
+            <w:tcBorders>
+              <w:top w:val="single" w:color="808080" w:sz="4"/>
+              <w:left w:val="single" w:color="808080" w:sz="4"/>
+              <w:bottom w:val="single" w:color="808080" w:sz="4"/>
+              <w:right w:val="single" w:color="808080" w:sz="4"/>
+            </w:tcBorders>
+            <w:tcMar>
+              <w:top w:type="dxa" w:w="60"/>
+              <w:left w:type="dxa" w:w="100"/>
+              <w:bottom w:type="dxa" w:w="60"/>
+              <w:right w:type="dxa" w:w="100"/>
+            </w:tcMar>
+          </w:tcPr>
+          <w:p>
+            <w:r>
+              <w:rPr>
+                <w:rFonts w:ascii="Arial" w:cs="Arial" w:eastAsia="Arial" w:hAnsi="Arial"/>
+                <w:sz w:val="20"/>
+                <w:szCs w:val="20"/>
+              </w:rPr>
+              <w:t xml:space="preserve">22</w:t>
+            </w:r>
+          </w:p>
+        </w:tc>
+        <w:tc>
+          <w:tcPr>
+            <w:tcW w:type="dxa" w:w="8638"/>
+            <w:tcBorders>
+              <w:top w:val="single" w:color="808080" w:sz="4"/>
+              <w:left w:val="single" w:color="808080" w:sz="4"/>
+              <w:bottom w:val="single" w:color="808080" w:sz="4"/>
+              <w:right w:val="single" w:color="808080" w:sz="4"/>
+            </w:tcBorders>
+            <w:tcMar>
+              <w:top w:type="dxa" w:w="60"/>
+              <w:left w:type="dxa" w:w="100"/>
+              <w:bottom w:type="dxa" w:w="60"/>
+              <w:right w:type="dxa" w:w="100"/>
+            </w:tcMar>
+          </w:tcPr>
+          <w:p>
+            <w:r>
+              <w:rPr>
+                <w:rFonts w:ascii="Arial" w:cs="Arial" w:eastAsia="Arial" w:hAnsi="Arial"/>
+                <w:sz w:val="20"/>
+                <w:szCs w:val="20"/>
+              </w:rPr>
+              <w:t xml:space="preserve">Dom laut DomeNo nicht vorhanden: weniger offene Dome erkannt</w:t>
             </w:r>
           </w:p>
         </w:tc>
@@ -6294,6 +6551,66 @@
                 <w:szCs w:val="20"/>
               </w:rPr>
               <w:t xml:space="preserve">3</w:t>
+            </w:r>
+          </w:p>
+        </w:tc>
+        <w:tc>
+          <w:tcPr>
+            <w:tcW w:type="dxa" w:w="8638"/>
+            <w:tcBorders>
+              <w:top w:val="single" w:color="808080" w:sz="4"/>
+              <w:left w:val="single" w:color="808080" w:sz="4"/>
+              <w:bottom w:val="single" w:color="808080" w:sz="4"/>
+              <w:right w:val="single" w:color="808080" w:sz="4"/>
+            </w:tcBorders>
+            <w:tcMar>
+              <w:top w:type="dxa" w:w="60"/>
+              <w:left w:type="dxa" w:w="100"/>
+              <w:bottom w:type="dxa" w:w="60"/>
+              <w:right w:type="dxa" w:w="100"/>
+            </w:tcMar>
+          </w:tcPr>
+          <w:p>
+            <w:r>
+              <w:rPr>
+                <w:rFonts w:ascii="Arial" w:cs="Arial" w:eastAsia="Arial" w:hAnsi="Arial"/>
+                <w:sz w:val="20"/>
+                <w:szCs w:val="20"/>
+              </w:rPr>
+              <w:t xml:space="preserve">Mehrere Dome: DomeNo, DomeCount, DomeSelected, Fehler 22; Job 1 auch vom vorigen Dom aus</w:t>
+            </w:r>
+          </w:p>
+        </w:tc>
+      </w:tr>
+      <w:tr>
+        <w:trPr>
+          <w:cantSplit/>
+          <w:tblHeader w:val="off"/>
+        </w:trPr>
+        <w:tc>
+          <w:tcPr>
+            <w:tcW w:type="dxa" w:w="1000"/>
+            <w:tcBorders>
+              <w:top w:val="single" w:color="808080" w:sz="4"/>
+              <w:left w:val="single" w:color="808080" w:sz="4"/>
+              <w:bottom w:val="single" w:color="808080" w:sz="4"/>
+              <w:right w:val="single" w:color="808080" w:sz="4"/>
+            </w:tcBorders>
+            <w:tcMar>
+              <w:top w:type="dxa" w:w="60"/>
+              <w:left w:type="dxa" w:w="100"/>
+              <w:bottom w:type="dxa" w:w="60"/>
+              <w:right w:type="dxa" w:w="100"/>
+            </w:tcMar>
+          </w:tcPr>
+          <w:p>
+            <w:r>
+              <w:rPr>
+                <w:rFonts w:ascii="Arial" w:cs="Arial" w:eastAsia="Arial" w:hAnsi="Arial"/>
+                <w:sz w:val="20"/>
+                <w:szCs w:val="20"/>
+              </w:rPr>
+              <w:t xml:space="preserve">4</w:t>
             </w:r>
           </w:p>
         </w:tc>
@@ -6662,6 +6979,93 @@
                 <w:szCs w:val="20"/>
               </w:rPr>
               <w:t xml:space="preserve">bestimmt Eintauchtiefe und Füllende</w:t>
+            </w:r>
+          </w:p>
+        </w:tc>
+      </w:tr>
+      <w:tr>
+        <w:trPr>
+          <w:cantSplit/>
+          <w:tblHeader w:val="off"/>
+        </w:trPr>
+        <w:tc>
+          <w:tcPr>
+            <w:tcW w:type="dxa" w:w="4300"/>
+            <w:tcBorders>
+              <w:top w:val="single" w:color="808080" w:sz="4"/>
+              <w:left w:val="single" w:color="808080" w:sz="4"/>
+              <w:bottom w:val="single" w:color="808080" w:sz="4"/>
+              <w:right w:val="single" w:color="808080" w:sz="4"/>
+            </w:tcBorders>
+            <w:tcMar>
+              <w:top w:type="dxa" w:w="60"/>
+              <w:left w:type="dxa" w:w="100"/>
+              <w:bottom w:type="dxa" w:w="60"/>
+              <w:right w:type="dxa" w:w="100"/>
+            </w:tcMar>
+          </w:tcPr>
+          <w:p>
+            <w:r>
+              <w:rPr>
+                <w:rFonts w:ascii="Arial" w:cs="Arial" w:eastAsia="Arial" w:hAnsi="Arial"/>
+                <w:sz w:val="20"/>
+                <w:szCs w:val="20"/>
+              </w:rPr>
+              <w:t xml:space="preserve">Füllschritte (Dom, Menge)</w:t>
+            </w:r>
+          </w:p>
+        </w:tc>
+        <w:tc>
+          <w:tcPr>
+            <w:tcW w:type="dxa" w:w="1300"/>
+            <w:tcBorders>
+              <w:top w:val="single" w:color="808080" w:sz="4"/>
+              <w:left w:val="single" w:color="808080" w:sz="4"/>
+              <w:bottom w:val="single" w:color="808080" w:sz="4"/>
+              <w:right w:val="single" w:color="808080" w:sz="4"/>
+            </w:tcBorders>
+            <w:tcMar>
+              <w:top w:type="dxa" w:w="60"/>
+              <w:left w:type="dxa" w:w="100"/>
+              <w:bottom w:type="dxa" w:w="60"/>
+              <w:right w:type="dxa" w:w="100"/>
+            </w:tcMar>
+          </w:tcPr>
+          <w:p>
+            <w:r>
+              <w:rPr>
+                <w:rFonts w:ascii="Arial" w:cs="Arial" w:eastAsia="Arial" w:hAnsi="Arial"/>
+                <w:sz w:val="20"/>
+                <w:szCs w:val="20"/>
+              </w:rPr>
+              <w:t xml:space="preserve">PLS → SPS</w:t>
+            </w:r>
+          </w:p>
+        </w:tc>
+        <w:tc>
+          <w:tcPr>
+            <w:tcW w:type="dxa" w:w="4038"/>
+            <w:tcBorders>
+              <w:top w:val="single" w:color="808080" w:sz="4"/>
+              <w:left w:val="single" w:color="808080" w:sz="4"/>
+              <w:bottom w:val="single" w:color="808080" w:sz="4"/>
+              <w:right w:val="single" w:color="808080" w:sz="4"/>
+            </w:tcBorders>
+            <w:tcMar>
+              <w:top w:type="dxa" w:w="60"/>
+              <w:left w:type="dxa" w:w="100"/>
+              <w:bottom w:type="dxa" w:w="60"/>
+              <w:right w:type="dxa" w:w="100"/>
+            </w:tcMar>
+          </w:tcPr>
+          <w:p>
+            <w:r>
+              <w:rPr>
+                <w:rFonts w:ascii="Arial" w:cs="Arial" w:eastAsia="Arial" w:hAnsi="Arial"/>
+                <w:sz w:val="20"/>
+                <w:szCs w:val="20"/>
+              </w:rPr>
+              <w:t xml:space="preserve">Kammern verbunden: ein Schritt, Dom 0; Mehrkammer: Dom 1, 2, … von vorn je Kammer</w:t>
             </w:r>
           </w:p>
         </w:tc>

</xml_diff>